<commit_message>
v0.4.8 Soundtrack Quick Patch
</commit_message>
<xml_diff>
--- a/PATCH_NOTES_v0.4.8.docx
+++ b/PATCH_NOTES_v0.4.8.docx
@@ -1348,32 +1348,6 @@
     </w:p>
     <w:p>
       <w:pPr>
-        <w:pStyle w:val="ListParagraph"/>
-        <w:numPr>
-          <w:ilvl w:val="0"/>
-          <w:numId w:val="2"/>
-        </w:numPr>
-        <w:spacing w:after="80" w:line="276"/>
-      </w:pPr>
-      <w:r>
-        <w:rPr>
-          <w:rFonts w:ascii="Calibri" w:cs="Calibri" w:eastAsia="Calibri" w:hAnsi="Calibri"/>
-          <w:b/>
-          <w:bCs/>
-          <w:color w:val="1F2328"/>
-        </w:rPr>
-        <w:t xml:space="preserve">Badge progress after a game</w:t>
-      </w:r>
-      <w:r>
-        <w:rPr>
-          <w:rFonts w:ascii="Calibri" w:cs="Calibri" w:eastAsia="Calibri" w:hAnsi="Calibri"/>
-          <w:color w:val="1F2328"/>
-        </w:rPr>
-        <w:t xml:space="preserve"> lists every badge that moved, not just the first six. Each one shows its progress to the next tier, "top tier for your build", or "not for your build".</w:t>
-      </w:r>
-    </w:p>
-    <w:p>
-      <w:pPr>
         <w:pBdr>
           <w:bottom w:val="single" w:color="D0D7DE" w:sz="4" w:space="1"/>
         </w:pBdr>
@@ -1563,6 +1537,981 @@
           <w:sz w:val="32"/>
           <w:szCs w:val="32"/>
         </w:rPr>
+        <w:t xml:space="preserve">Quick patch (Oct 13)</w:t>
+      </w:r>
+    </w:p>
+    <w:p>
+      <w:pPr>
+        <w:pStyle w:val="ListParagraph"/>
+        <w:numPr>
+          <w:ilvl w:val="0"/>
+          <w:numId w:val="2"/>
+        </w:numPr>
+        <w:spacing w:after="80" w:line="276"/>
+      </w:pPr>
+      <w:r>
+        <w:rPr>
+          <w:rFonts w:ascii="Calibri" w:cs="Calibri" w:eastAsia="Calibri" w:hAnsi="Calibri"/>
+          <w:b/>
+          <w:bCs/>
+          <w:color w:val="1F2328"/>
+        </w:rPr>
+        <w:t xml:space="preserve">Badge progress after a game</w:t>
+      </w:r>
+      <w:r>
+        <w:rPr>
+          <w:rFonts w:ascii="Calibri" w:cs="Calibri" w:eastAsia="Calibri" w:hAnsi="Calibri"/>
+          <w:color w:val="1F2328"/>
+        </w:rPr>
+        <w:t xml:space="preserve"> looks the way it always did, one line under the results. The fix is underneath it: every Pro Run game counts toward your badges, a long one with a big stat line included (see </w:t>
+      </w:r>
+      <w:r>
+        <w:rPr>
+          <w:rFonts w:ascii="Calibri" w:cs="Calibri" w:eastAsia="Calibri" w:hAnsi="Calibri"/>
+          <w:b/>
+          <w:bCs/>
+          <w:color w:val="1F2328"/>
+        </w:rPr>
+        <w:t xml:space="preserve">The Pro Run counts again</w:t>
+      </w:r>
+      <w:r>
+        <w:rPr>
+          <w:rFonts w:ascii="Calibri" w:cs="Calibri" w:eastAsia="Calibri" w:hAnsi="Calibri"/>
+          <w:color w:val="1F2328"/>
+        </w:rPr>
+        <w:t xml:space="preserve">). A new test plays two long Pro Run games through the game's service and checks that both land on the player's badges.</w:t>
+      </w:r>
+    </w:p>
+    <w:p>
+      <w:pPr>
+        <w:pStyle w:val="ListParagraph"/>
+        <w:numPr>
+          <w:ilvl w:val="0"/>
+          <w:numId w:val="2"/>
+        </w:numPr>
+        <w:spacing w:after="80" w:line="276"/>
+      </w:pPr>
+      <w:r>
+        <w:rPr>
+          <w:rFonts w:ascii="Calibri" w:cs="Calibri" w:eastAsia="Calibri" w:hAnsi="Calibri"/>
+          <w:b/>
+          <w:bCs/>
+          <w:color w:val="1F2328"/>
+        </w:rPr>
+        <w:t xml:space="preserve">Hall of Fame sooner:</w:t>
+      </w:r>
+    </w:p>
+    <w:p>
+      <w:pPr>
+        <w:pStyle w:val="ListParagraph"/>
+        <w:numPr>
+          <w:ilvl w:val="1"/>
+          <w:numId w:val="2"/>
+        </w:numPr>
+        <w:spacing w:after="80" w:line="276"/>
+      </w:pPr>
+      <w:r>
+        <w:rPr>
+          <w:rFonts w:ascii="Calibri" w:cs="Calibri" w:eastAsia="Calibri" w:hAnsi="Calibri"/>
+          <w:b/>
+          <w:bCs/>
+          <w:color w:val="1F2328"/>
+        </w:rPr>
+        <w:t xml:space="preserve">Handles for Days</w:t>
+      </w:r>
+      <w:r>
+        <w:rPr>
+          <w:rFonts w:ascii="Calibri" w:cs="Calibri" w:eastAsia="Calibri" w:hAnsi="Calibri"/>
+          <w:color w:val="1F2328"/>
+        </w:rPr>
+        <w:t xml:space="preserve"> at </w:t>
+      </w:r>
+      <w:r>
+        <w:rPr>
+          <w:rFonts w:ascii="Calibri" w:cs="Calibri" w:eastAsia="Calibri" w:hAnsi="Calibri"/>
+          <w:b/>
+          <w:bCs/>
+          <w:color w:val="1F2328"/>
+        </w:rPr>
+        <w:t xml:space="preserve">115 games played</w:t>
+      </w:r>
+      <w:r>
+        <w:rPr>
+          <w:rFonts w:ascii="Calibri" w:cs="Calibri" w:eastAsia="Calibri" w:hAnsi="Calibri"/>
+          <w:color w:val="1F2328"/>
+        </w:rPr>
+        <w:t xml:space="preserve"> (was 160).</w:t>
+      </w:r>
+    </w:p>
+    <w:p>
+      <w:pPr>
+        <w:pStyle w:val="ListParagraph"/>
+        <w:numPr>
+          <w:ilvl w:val="1"/>
+          <w:numId w:val="2"/>
+        </w:numPr>
+        <w:spacing w:after="80" w:line="276"/>
+      </w:pPr>
+      <w:r>
+        <w:rPr>
+          <w:rFonts w:ascii="Calibri" w:cs="Calibri" w:eastAsia="Calibri" w:hAnsi="Calibri"/>
+          <w:b/>
+          <w:bCs/>
+          <w:color w:val="1F2328"/>
+        </w:rPr>
+        <w:t xml:space="preserve">Deadeye</w:t>
+      </w:r>
+      <w:r>
+        <w:rPr>
+          <w:rFonts w:ascii="Calibri" w:cs="Calibri" w:eastAsia="Calibri" w:hAnsi="Calibri"/>
+          <w:color w:val="1F2328"/>
+        </w:rPr>
+        <w:t xml:space="preserve"> at </w:t>
+      </w:r>
+      <w:r>
+        <w:rPr>
+          <w:rFonts w:ascii="Calibri" w:cs="Calibri" w:eastAsia="Calibri" w:hAnsi="Calibri"/>
+          <w:b/>
+          <w:bCs/>
+          <w:color w:val="1F2328"/>
+        </w:rPr>
+        <w:t xml:space="preserve">135 contested makes</w:t>
+      </w:r>
+      <w:r>
+        <w:rPr>
+          <w:rFonts w:ascii="Calibri" w:cs="Calibri" w:eastAsia="Calibri" w:hAnsi="Calibri"/>
+          <w:color w:val="1F2328"/>
+        </w:rPr>
+        <w:t xml:space="preserve"> (was 220).</w:t>
+      </w:r>
+    </w:p>
+    <w:p>
+      <w:pPr>
+        <w:pStyle w:val="ListParagraph"/>
+        <w:numPr>
+          <w:ilvl w:val="1"/>
+          <w:numId w:val="2"/>
+        </w:numPr>
+        <w:spacing w:after="80" w:line="276"/>
+      </w:pPr>
+      <w:r>
+        <w:rPr>
+          <w:rFonts w:ascii="Calibri" w:cs="Calibri" w:eastAsia="Calibri" w:hAnsi="Calibri"/>
+          <w:color w:val="1F2328"/>
+        </w:rPr>
+        <w:t xml:space="preserve">A player already past the new mark gets the upgrade (and its cap breakers) after his next game.</w:t>
+      </w:r>
+    </w:p>
+    <w:p>
+      <w:pPr>
+        <w:pStyle w:val="ListParagraph"/>
+        <w:numPr>
+          <w:ilvl w:val="0"/>
+          <w:numId w:val="2"/>
+        </w:numPr>
+        <w:spacing w:after="80" w:line="276"/>
+      </w:pPr>
+      <w:r>
+        <w:rPr>
+          <w:rFonts w:ascii="Calibri" w:cs="Calibri" w:eastAsia="Calibri" w:hAnsi="Calibri"/>
+          <w:b/>
+          <w:bCs/>
+          <w:color w:val="1F2328"/>
+        </w:rPr>
+        <w:t xml:space="preserve">Soundtrack:</w:t>
+      </w:r>
+      <w:r>
+        <w:rPr>
+          <w:rFonts w:ascii="Calibri" w:cs="Calibri" w:eastAsia="Calibri" w:hAnsi="Calibri"/>
+          <w:color w:val="1F2328"/>
+        </w:rPr>
+        <w:t xml:space="preserve"> five new mixes, almost 8 hours in all. Each one is split into parts under 30 MB at a quiet moment, and the parts play back to back.</w:t>
+      </w:r>
+    </w:p>
+    <w:tbl>
+      <w:tblPr>
+        <w:tblW w:type="dxa" w:w="9360"/>
+        <w:tblBorders>
+          <w:top w:val="single" w:color="auto" w:sz="4"/>
+          <w:left w:val="single" w:color="auto" w:sz="4"/>
+          <w:bottom w:val="single" w:color="auto" w:sz="4"/>
+          <w:right w:val="single" w:color="auto" w:sz="4"/>
+          <w:insideH w:val="single" w:color="auto" w:sz="4"/>
+          <w:insideV w:val="single" w:color="auto" w:sz="4"/>
+        </w:tblBorders>
+      </w:tblPr>
+      <w:tblGrid>
+        <w:gridCol w:w="4680"/>
+        <w:gridCol w:w="1560"/>
+        <w:gridCol w:w="1560"/>
+        <w:gridCol w:w="1560"/>
+      </w:tblGrid>
+      <w:tr>
+        <w:trPr>
+          <w:tblHeader/>
+        </w:trPr>
+        <w:tc>
+          <w:tcPr>
+            <w:tcW w:type="dxa" w:w="4680"/>
+            <w:tcBorders>
+              <w:top w:val="single" w:color="D0D7DE" w:sz="4"/>
+              <w:left w:val="single" w:color="D0D7DE" w:sz="4"/>
+              <w:bottom w:val="single" w:color="D0D7DE" w:sz="4"/>
+              <w:right w:val="single" w:color="D0D7DE" w:sz="4"/>
+            </w:tcBorders>
+            <w:shd w:fill="F3E3E6" w:color="auto" w:val="clear"/>
+            <w:tcMar>
+              <w:top w:type="dxa" w:w="60"/>
+              <w:left w:type="dxa" w:w="100"/>
+              <w:bottom w:type="dxa" w:w="60"/>
+              <w:right w:type="dxa" w:w="100"/>
+            </w:tcMar>
+          </w:tcPr>
+          <w:p>
+            <w:pPr>
+              <w:jc w:val="left"/>
+            </w:pPr>
+            <w:r>
+              <w:rPr>
+                <w:rFonts w:ascii="Calibri" w:cs="Calibri" w:eastAsia="Calibri" w:hAnsi="Calibri"/>
+                <w:b/>
+                <w:bCs/>
+                <w:color w:val="1F2328"/>
+              </w:rPr>
+              <w:t xml:space="preserve">Mix</w:t>
+            </w:r>
+          </w:p>
+        </w:tc>
+        <w:tc>
+          <w:tcPr>
+            <w:tcW w:type="dxa" w:w="1560"/>
+            <w:tcBorders>
+              <w:top w:val="single" w:color="D0D7DE" w:sz="4"/>
+              <w:left w:val="single" w:color="D0D7DE" w:sz="4"/>
+              <w:bottom w:val="single" w:color="D0D7DE" w:sz="4"/>
+              <w:right w:val="single" w:color="D0D7DE" w:sz="4"/>
+            </w:tcBorders>
+            <w:shd w:fill="F3E3E6" w:color="auto" w:val="clear"/>
+            <w:tcMar>
+              <w:top w:type="dxa" w:w="60"/>
+              <w:left w:type="dxa" w:w="100"/>
+              <w:bottom w:type="dxa" w:w="60"/>
+              <w:right w:type="dxa" w:w="100"/>
+            </w:tcMar>
+          </w:tcPr>
+          <w:p>
+            <w:pPr>
+              <w:jc w:val="center"/>
+            </w:pPr>
+            <w:r>
+              <w:rPr>
+                <w:rFonts w:ascii="Calibri" w:cs="Calibri" w:eastAsia="Calibri" w:hAnsi="Calibri"/>
+                <w:b/>
+                <w:bCs/>
+                <w:color w:val="1F2328"/>
+              </w:rPr>
+              <w:t xml:space="preserve">Artist</w:t>
+            </w:r>
+          </w:p>
+        </w:tc>
+        <w:tc>
+          <w:tcPr>
+            <w:tcW w:type="dxa" w:w="1560"/>
+            <w:tcBorders>
+              <w:top w:val="single" w:color="D0D7DE" w:sz="4"/>
+              <w:left w:val="single" w:color="D0D7DE" w:sz="4"/>
+              <w:bottom w:val="single" w:color="D0D7DE" w:sz="4"/>
+              <w:right w:val="single" w:color="D0D7DE" w:sz="4"/>
+            </w:tcBorders>
+            <w:shd w:fill="F3E3E6" w:color="auto" w:val="clear"/>
+            <w:tcMar>
+              <w:top w:type="dxa" w:w="60"/>
+              <w:left w:type="dxa" w:w="100"/>
+              <w:bottom w:type="dxa" w:w="60"/>
+              <w:right w:type="dxa" w:w="100"/>
+            </w:tcMar>
+          </w:tcPr>
+          <w:p>
+            <w:pPr>
+              <w:jc w:val="center"/>
+            </w:pPr>
+            <w:r>
+              <w:rPr>
+                <w:rFonts w:ascii="Calibri" w:cs="Calibri" w:eastAsia="Calibri" w:hAnsi="Calibri"/>
+                <w:b/>
+                <w:bCs/>
+                <w:color w:val="1F2328"/>
+              </w:rPr>
+              <w:t xml:space="preserve">Length</w:t>
+            </w:r>
+          </w:p>
+        </w:tc>
+        <w:tc>
+          <w:tcPr>
+            <w:tcW w:type="dxa" w:w="1560"/>
+            <w:tcBorders>
+              <w:top w:val="single" w:color="D0D7DE" w:sz="4"/>
+              <w:left w:val="single" w:color="D0D7DE" w:sz="4"/>
+              <w:bottom w:val="single" w:color="D0D7DE" w:sz="4"/>
+              <w:right w:val="single" w:color="D0D7DE" w:sz="4"/>
+            </w:tcBorders>
+            <w:shd w:fill="F3E3E6" w:color="auto" w:val="clear"/>
+            <w:tcMar>
+              <w:top w:type="dxa" w:w="60"/>
+              <w:left w:type="dxa" w:w="100"/>
+              <w:bottom w:type="dxa" w:w="60"/>
+              <w:right w:type="dxa" w:w="100"/>
+            </w:tcMar>
+          </w:tcPr>
+          <w:p>
+            <w:pPr>
+              <w:jc w:val="center"/>
+            </w:pPr>
+            <w:r>
+              <w:rPr>
+                <w:rFonts w:ascii="Calibri" w:cs="Calibri" w:eastAsia="Calibri" w:hAnsi="Calibri"/>
+                <w:b/>
+                <w:bCs/>
+                <w:color w:val="1F2328"/>
+              </w:rPr>
+              <w:t xml:space="preserve">Parts</w:t>
+            </w:r>
+          </w:p>
+        </w:tc>
+      </w:tr>
+      <w:tr>
+        <w:trPr>
+          <w:tblHeader w:val="false"/>
+        </w:trPr>
+        <w:tc>
+          <w:tcPr>
+            <w:tcW w:type="dxa" w:w="4680"/>
+            <w:tcBorders>
+              <w:top w:val="single" w:color="D0D7DE" w:sz="4"/>
+              <w:left w:val="single" w:color="D0D7DE" w:sz="4"/>
+              <w:bottom w:val="single" w:color="D0D7DE" w:sz="4"/>
+              <w:right w:val="single" w:color="D0D7DE" w:sz="4"/>
+            </w:tcBorders>
+            <w:tcMar>
+              <w:top w:type="dxa" w:w="60"/>
+              <w:left w:type="dxa" w:w="100"/>
+              <w:bottom w:type="dxa" w:w="60"/>
+              <w:right w:type="dxa" w:w="100"/>
+            </w:tcMar>
+          </w:tcPr>
+          <w:p>
+            <w:pPr>
+              <w:jc w:val="left"/>
+            </w:pPr>
+            <w:r>
+              <w:rPr>
+                <w:rFonts w:ascii="Calibri" w:cs="Calibri" w:eastAsia="Calibri" w:hAnsi="Calibri"/>
+                <w:color w:val="1F2328"/>
+              </w:rPr>
+              <w:t xml:space="preserve">Family Tree Vol. 10 · OROSA (Live Mix)</w:t>
+            </w:r>
+          </w:p>
+        </w:tc>
+        <w:tc>
+          <w:tcPr>
+            <w:tcW w:type="dxa" w:w="1560"/>
+            <w:tcBorders>
+              <w:top w:val="single" w:color="D0D7DE" w:sz="4"/>
+              <w:left w:val="single" w:color="D0D7DE" w:sz="4"/>
+              <w:bottom w:val="single" w:color="D0D7DE" w:sz="4"/>
+              <w:right w:val="single" w:color="D0D7DE" w:sz="4"/>
+            </w:tcBorders>
+            <w:tcMar>
+              <w:top w:type="dxa" w:w="60"/>
+              <w:left w:type="dxa" w:w="100"/>
+              <w:bottom w:type="dxa" w:w="60"/>
+              <w:right w:type="dxa" w:w="100"/>
+            </w:tcMar>
+          </w:tcPr>
+          <w:p>
+            <w:pPr>
+              <w:jc w:val="center"/>
+            </w:pPr>
+            <w:r>
+              <w:rPr>
+                <w:rFonts w:ascii="Calibri" w:cs="Calibri" w:eastAsia="Calibri" w:hAnsi="Calibri"/>
+                <w:color w:val="1F2328"/>
+              </w:rPr>
+              <w:t xml:space="preserve">The Family Tree</w:t>
+            </w:r>
+          </w:p>
+        </w:tc>
+        <w:tc>
+          <w:tcPr>
+            <w:tcW w:type="dxa" w:w="1560"/>
+            <w:tcBorders>
+              <w:top w:val="single" w:color="D0D7DE" w:sz="4"/>
+              <w:left w:val="single" w:color="D0D7DE" w:sz="4"/>
+              <w:bottom w:val="single" w:color="D0D7DE" w:sz="4"/>
+              <w:right w:val="single" w:color="D0D7DE" w:sz="4"/>
+            </w:tcBorders>
+            <w:tcMar>
+              <w:top w:type="dxa" w:w="60"/>
+              <w:left w:type="dxa" w:w="100"/>
+              <w:bottom w:type="dxa" w:w="60"/>
+              <w:right w:type="dxa" w:w="100"/>
+            </w:tcMar>
+          </w:tcPr>
+          <w:p>
+            <w:pPr>
+              <w:jc w:val="center"/>
+            </w:pPr>
+            <w:r>
+              <w:rPr>
+                <w:rFonts w:ascii="Calibri" w:cs="Calibri" w:eastAsia="Calibri" w:hAnsi="Calibri"/>
+                <w:color w:val="1F2328"/>
+              </w:rPr>
+              <w:t xml:space="preserve">56 min</w:t>
+            </w:r>
+          </w:p>
+        </w:tc>
+        <w:tc>
+          <w:tcPr>
+            <w:tcW w:type="dxa" w:w="1560"/>
+            <w:tcBorders>
+              <w:top w:val="single" w:color="D0D7DE" w:sz="4"/>
+              <w:left w:val="single" w:color="D0D7DE" w:sz="4"/>
+              <w:bottom w:val="single" w:color="D0D7DE" w:sz="4"/>
+              <w:right w:val="single" w:color="D0D7DE" w:sz="4"/>
+            </w:tcBorders>
+            <w:tcMar>
+              <w:top w:type="dxa" w:w="60"/>
+              <w:left w:type="dxa" w:w="100"/>
+              <w:bottom w:type="dxa" w:w="60"/>
+              <w:right w:type="dxa" w:w="100"/>
+            </w:tcMar>
+          </w:tcPr>
+          <w:p>
+            <w:pPr>
+              <w:jc w:val="center"/>
+            </w:pPr>
+            <w:r>
+              <w:rPr>
+                <w:rFonts w:ascii="Calibri" w:cs="Calibri" w:eastAsia="Calibri" w:hAnsi="Calibri"/>
+                <w:color w:val="1F2328"/>
+              </w:rPr>
+              <w:t xml:space="preserve">2</w:t>
+            </w:r>
+          </w:p>
+        </w:tc>
+      </w:tr>
+      <w:tr>
+        <w:trPr>
+          <w:tblHeader w:val="false"/>
+        </w:trPr>
+        <w:tc>
+          <w:tcPr>
+            <w:tcW w:type="dxa" w:w="4680"/>
+            <w:tcBorders>
+              <w:top w:val="single" w:color="D0D7DE" w:sz="4"/>
+              <w:left w:val="single" w:color="D0D7DE" w:sz="4"/>
+              <w:bottom w:val="single" w:color="D0D7DE" w:sz="4"/>
+              <w:right w:val="single" w:color="D0D7DE" w:sz="4"/>
+            </w:tcBorders>
+            <w:tcMar>
+              <w:top w:type="dxa" w:w="60"/>
+              <w:left w:type="dxa" w:w="100"/>
+              <w:bottom w:type="dxa" w:w="60"/>
+              <w:right w:type="dxa" w:w="100"/>
+            </w:tcMar>
+          </w:tcPr>
+          <w:p>
+            <w:pPr>
+              <w:jc w:val="left"/>
+            </w:pPr>
+            <w:r>
+              <w:rPr>
+                <w:rFonts w:ascii="Calibri" w:cs="Calibri" w:eastAsia="Calibri" w:hAnsi="Calibri"/>
+                <w:color w:val="1F2328"/>
+              </w:rPr>
+              <w:t xml:space="preserve">Show #626 (Full Crate Takeover)</w:t>
+            </w:r>
+          </w:p>
+        </w:tc>
+        <w:tc>
+          <w:tcPr>
+            <w:tcW w:type="dxa" w:w="1560"/>
+            <w:tcBorders>
+              <w:top w:val="single" w:color="D0D7DE" w:sz="4"/>
+              <w:left w:val="single" w:color="D0D7DE" w:sz="4"/>
+              <w:bottom w:val="single" w:color="D0D7DE" w:sz="4"/>
+              <w:right w:val="single" w:color="D0D7DE" w:sz="4"/>
+            </w:tcBorders>
+            <w:tcMar>
+              <w:top w:type="dxa" w:w="60"/>
+              <w:left w:type="dxa" w:w="100"/>
+              <w:bottom w:type="dxa" w:w="60"/>
+              <w:right w:type="dxa" w:w="100"/>
+            </w:tcMar>
+          </w:tcPr>
+          <w:p>
+            <w:pPr>
+              <w:jc w:val="center"/>
+            </w:pPr>
+            <w:r>
+              <w:rPr>
+                <w:rFonts w:ascii="Calibri" w:cs="Calibri" w:eastAsia="Calibri" w:hAnsi="Calibri"/>
+                <w:color w:val="1F2328"/>
+              </w:rPr>
+              <w:t xml:space="preserve">Soulection</w:t>
+            </w:r>
+          </w:p>
+        </w:tc>
+        <w:tc>
+          <w:tcPr>
+            <w:tcW w:type="dxa" w:w="1560"/>
+            <w:tcBorders>
+              <w:top w:val="single" w:color="D0D7DE" w:sz="4"/>
+              <w:left w:val="single" w:color="D0D7DE" w:sz="4"/>
+              <w:bottom w:val="single" w:color="D0D7DE" w:sz="4"/>
+              <w:right w:val="single" w:color="D0D7DE" w:sz="4"/>
+            </w:tcBorders>
+            <w:tcMar>
+              <w:top w:type="dxa" w:w="60"/>
+              <w:left w:type="dxa" w:w="100"/>
+              <w:bottom w:type="dxa" w:w="60"/>
+              <w:right w:type="dxa" w:w="100"/>
+            </w:tcMar>
+          </w:tcPr>
+          <w:p>
+            <w:pPr>
+              <w:jc w:val="center"/>
+            </w:pPr>
+            <w:r>
+              <w:rPr>
+                <w:rFonts w:ascii="Calibri" w:cs="Calibri" w:eastAsia="Calibri" w:hAnsi="Calibri"/>
+                <w:color w:val="1F2328"/>
+              </w:rPr>
+              <w:t xml:space="preserve">2 h</w:t>
+            </w:r>
+          </w:p>
+        </w:tc>
+        <w:tc>
+          <w:tcPr>
+            <w:tcW w:type="dxa" w:w="1560"/>
+            <w:tcBorders>
+              <w:top w:val="single" w:color="D0D7DE" w:sz="4"/>
+              <w:left w:val="single" w:color="D0D7DE" w:sz="4"/>
+              <w:bottom w:val="single" w:color="D0D7DE" w:sz="4"/>
+              <w:right w:val="single" w:color="D0D7DE" w:sz="4"/>
+            </w:tcBorders>
+            <w:tcMar>
+              <w:top w:type="dxa" w:w="60"/>
+              <w:left w:type="dxa" w:w="100"/>
+              <w:bottom w:type="dxa" w:w="60"/>
+              <w:right w:type="dxa" w:w="100"/>
+            </w:tcMar>
+          </w:tcPr>
+          <w:p>
+            <w:pPr>
+              <w:jc w:val="center"/>
+            </w:pPr>
+            <w:r>
+              <w:rPr>
+                <w:rFonts w:ascii="Calibri" w:cs="Calibri" w:eastAsia="Calibri" w:hAnsi="Calibri"/>
+                <w:color w:val="1F2328"/>
+              </w:rPr>
+              <w:t xml:space="preserve">5</w:t>
+            </w:r>
+          </w:p>
+        </w:tc>
+      </w:tr>
+      <w:tr>
+        <w:trPr>
+          <w:tblHeader w:val="false"/>
+        </w:trPr>
+        <w:tc>
+          <w:tcPr>
+            <w:tcW w:type="dxa" w:w="4680"/>
+            <w:tcBorders>
+              <w:top w:val="single" w:color="D0D7DE" w:sz="4"/>
+              <w:left w:val="single" w:color="D0D7DE" w:sz="4"/>
+              <w:bottom w:val="single" w:color="D0D7DE" w:sz="4"/>
+              <w:right w:val="single" w:color="D0D7DE" w:sz="4"/>
+            </w:tcBorders>
+            <w:tcMar>
+              <w:top w:type="dxa" w:w="60"/>
+              <w:left w:type="dxa" w:w="100"/>
+              <w:bottom w:type="dxa" w:w="60"/>
+              <w:right w:type="dxa" w:w="100"/>
+            </w:tcMar>
+          </w:tcPr>
+          <w:p>
+            <w:pPr>
+              <w:jc w:val="left"/>
+            </w:pPr>
+            <w:r>
+              <w:rPr>
+                <w:rFonts w:ascii="Calibri" w:cs="Calibri" w:eastAsia="Calibri" w:hAnsi="Calibri"/>
+                <w:color w:val="1F2328"/>
+              </w:rPr>
+              <w:t xml:space="preserve">Show #631 (Olea Takeover)</w:t>
+            </w:r>
+          </w:p>
+        </w:tc>
+        <w:tc>
+          <w:tcPr>
+            <w:tcW w:type="dxa" w:w="1560"/>
+            <w:tcBorders>
+              <w:top w:val="single" w:color="D0D7DE" w:sz="4"/>
+              <w:left w:val="single" w:color="D0D7DE" w:sz="4"/>
+              <w:bottom w:val="single" w:color="D0D7DE" w:sz="4"/>
+              <w:right w:val="single" w:color="D0D7DE" w:sz="4"/>
+            </w:tcBorders>
+            <w:tcMar>
+              <w:top w:type="dxa" w:w="60"/>
+              <w:left w:type="dxa" w:w="100"/>
+              <w:bottom w:type="dxa" w:w="60"/>
+              <w:right w:type="dxa" w:w="100"/>
+            </w:tcMar>
+          </w:tcPr>
+          <w:p>
+            <w:pPr>
+              <w:jc w:val="center"/>
+            </w:pPr>
+            <w:r>
+              <w:rPr>
+                <w:rFonts w:ascii="Calibri" w:cs="Calibri" w:eastAsia="Calibri" w:hAnsi="Calibri"/>
+                <w:color w:val="1F2328"/>
+              </w:rPr>
+              <w:t xml:space="preserve">Soulection</w:t>
+            </w:r>
+          </w:p>
+        </w:tc>
+        <w:tc>
+          <w:tcPr>
+            <w:tcW w:type="dxa" w:w="1560"/>
+            <w:tcBorders>
+              <w:top w:val="single" w:color="D0D7DE" w:sz="4"/>
+              <w:left w:val="single" w:color="D0D7DE" w:sz="4"/>
+              <w:bottom w:val="single" w:color="D0D7DE" w:sz="4"/>
+              <w:right w:val="single" w:color="D0D7DE" w:sz="4"/>
+            </w:tcBorders>
+            <w:tcMar>
+              <w:top w:type="dxa" w:w="60"/>
+              <w:left w:type="dxa" w:w="100"/>
+              <w:bottom w:type="dxa" w:w="60"/>
+              <w:right w:type="dxa" w:w="100"/>
+            </w:tcMar>
+          </w:tcPr>
+          <w:p>
+            <w:pPr>
+              <w:jc w:val="center"/>
+            </w:pPr>
+            <w:r>
+              <w:rPr>
+                <w:rFonts w:ascii="Calibri" w:cs="Calibri" w:eastAsia="Calibri" w:hAnsi="Calibri"/>
+                <w:color w:val="1F2328"/>
+              </w:rPr>
+              <w:t xml:space="preserve">2 h</w:t>
+            </w:r>
+          </w:p>
+        </w:tc>
+        <w:tc>
+          <w:tcPr>
+            <w:tcW w:type="dxa" w:w="1560"/>
+            <w:tcBorders>
+              <w:top w:val="single" w:color="D0D7DE" w:sz="4"/>
+              <w:left w:val="single" w:color="D0D7DE" w:sz="4"/>
+              <w:bottom w:val="single" w:color="D0D7DE" w:sz="4"/>
+              <w:right w:val="single" w:color="D0D7DE" w:sz="4"/>
+            </w:tcBorders>
+            <w:tcMar>
+              <w:top w:type="dxa" w:w="60"/>
+              <w:left w:type="dxa" w:w="100"/>
+              <w:bottom w:type="dxa" w:w="60"/>
+              <w:right w:type="dxa" w:w="100"/>
+            </w:tcMar>
+          </w:tcPr>
+          <w:p>
+            <w:pPr>
+              <w:jc w:val="center"/>
+            </w:pPr>
+            <w:r>
+              <w:rPr>
+                <w:rFonts w:ascii="Calibri" w:cs="Calibri" w:eastAsia="Calibri" w:hAnsi="Calibri"/>
+                <w:color w:val="1F2328"/>
+              </w:rPr>
+              <w:t xml:space="preserve">5</w:t>
+            </w:r>
+          </w:p>
+        </w:tc>
+      </w:tr>
+      <w:tr>
+        <w:trPr>
+          <w:tblHeader w:val="false"/>
+        </w:trPr>
+        <w:tc>
+          <w:tcPr>
+            <w:tcW w:type="dxa" w:w="4680"/>
+            <w:tcBorders>
+              <w:top w:val="single" w:color="D0D7DE" w:sz="4"/>
+              <w:left w:val="single" w:color="D0D7DE" w:sz="4"/>
+              <w:bottom w:val="single" w:color="D0D7DE" w:sz="4"/>
+              <w:right w:val="single" w:color="D0D7DE" w:sz="4"/>
+            </w:tcBorders>
+            <w:tcMar>
+              <w:top w:type="dxa" w:w="60"/>
+              <w:left w:type="dxa" w:w="100"/>
+              <w:bottom w:type="dxa" w:w="60"/>
+              <w:right w:type="dxa" w:w="100"/>
+            </w:tcMar>
+          </w:tcPr>
+          <w:p>
+            <w:pPr>
+              <w:jc w:val="left"/>
+            </w:pPr>
+            <w:r>
+              <w:rPr>
+                <w:rFonts w:ascii="Calibri" w:cs="Calibri" w:eastAsia="Calibri" w:hAnsi="Calibri"/>
+                <w:color w:val="1F2328"/>
+              </w:rPr>
+              <w:t xml:space="preserve">Soulection Radio Show #611 (Keyrah Takeover)</w:t>
+            </w:r>
+          </w:p>
+        </w:tc>
+        <w:tc>
+          <w:tcPr>
+            <w:tcW w:type="dxa" w:w="1560"/>
+            <w:tcBorders>
+              <w:top w:val="single" w:color="D0D7DE" w:sz="4"/>
+              <w:left w:val="single" w:color="D0D7DE" w:sz="4"/>
+              <w:bottom w:val="single" w:color="D0D7DE" w:sz="4"/>
+              <w:right w:val="single" w:color="D0D7DE" w:sz="4"/>
+            </w:tcBorders>
+            <w:tcMar>
+              <w:top w:type="dxa" w:w="60"/>
+              <w:left w:type="dxa" w:w="100"/>
+              <w:bottom w:type="dxa" w:w="60"/>
+              <w:right w:type="dxa" w:w="100"/>
+            </w:tcMar>
+          </w:tcPr>
+          <w:p>
+            <w:pPr>
+              <w:jc w:val="center"/>
+            </w:pPr>
+            <w:r>
+              <w:rPr>
+                <w:rFonts w:ascii="Calibri" w:cs="Calibri" w:eastAsia="Calibri" w:hAnsi="Calibri"/>
+                <w:color w:val="1F2328"/>
+              </w:rPr>
+              <w:t xml:space="preserve">Soulection</w:t>
+            </w:r>
+          </w:p>
+        </w:tc>
+        <w:tc>
+          <w:tcPr>
+            <w:tcW w:type="dxa" w:w="1560"/>
+            <w:tcBorders>
+              <w:top w:val="single" w:color="D0D7DE" w:sz="4"/>
+              <w:left w:val="single" w:color="D0D7DE" w:sz="4"/>
+              <w:bottom w:val="single" w:color="D0D7DE" w:sz="4"/>
+              <w:right w:val="single" w:color="D0D7DE" w:sz="4"/>
+            </w:tcBorders>
+            <w:tcMar>
+              <w:top w:type="dxa" w:w="60"/>
+              <w:left w:type="dxa" w:w="100"/>
+              <w:bottom w:type="dxa" w:w="60"/>
+              <w:right w:type="dxa" w:w="100"/>
+            </w:tcMar>
+          </w:tcPr>
+          <w:p>
+            <w:pPr>
+              <w:jc w:val="center"/>
+            </w:pPr>
+            <w:r>
+              <w:rPr>
+                <w:rFonts w:ascii="Calibri" w:cs="Calibri" w:eastAsia="Calibri" w:hAnsi="Calibri"/>
+                <w:color w:val="1F2328"/>
+              </w:rPr>
+              <w:t xml:space="preserve">2 h</w:t>
+            </w:r>
+          </w:p>
+        </w:tc>
+        <w:tc>
+          <w:tcPr>
+            <w:tcW w:type="dxa" w:w="1560"/>
+            <w:tcBorders>
+              <w:top w:val="single" w:color="D0D7DE" w:sz="4"/>
+              <w:left w:val="single" w:color="D0D7DE" w:sz="4"/>
+              <w:bottom w:val="single" w:color="D0D7DE" w:sz="4"/>
+              <w:right w:val="single" w:color="D0D7DE" w:sz="4"/>
+            </w:tcBorders>
+            <w:tcMar>
+              <w:top w:type="dxa" w:w="60"/>
+              <w:left w:type="dxa" w:w="100"/>
+              <w:bottom w:type="dxa" w:w="60"/>
+              <w:right w:type="dxa" w:w="100"/>
+            </w:tcMar>
+          </w:tcPr>
+          <w:p>
+            <w:pPr>
+              <w:jc w:val="center"/>
+            </w:pPr>
+            <w:r>
+              <w:rPr>
+                <w:rFonts w:ascii="Calibri" w:cs="Calibri" w:eastAsia="Calibri" w:hAnsi="Calibri"/>
+                <w:color w:val="1F2328"/>
+              </w:rPr>
+              <w:t xml:space="preserve">4</w:t>
+            </w:r>
+          </w:p>
+        </w:tc>
+      </w:tr>
+      <w:tr>
+        <w:trPr>
+          <w:tblHeader w:val="false"/>
+        </w:trPr>
+        <w:tc>
+          <w:tcPr>
+            <w:tcW w:type="dxa" w:w="4680"/>
+            <w:tcBorders>
+              <w:top w:val="single" w:color="D0D7DE" w:sz="4"/>
+              <w:left w:val="single" w:color="D0D7DE" w:sz="4"/>
+              <w:bottom w:val="single" w:color="D0D7DE" w:sz="4"/>
+              <w:right w:val="single" w:color="D0D7DE" w:sz="4"/>
+            </w:tcBorders>
+            <w:tcMar>
+              <w:top w:type="dxa" w:w="60"/>
+              <w:left w:type="dxa" w:w="100"/>
+              <w:bottom w:type="dxa" w:w="60"/>
+              <w:right w:type="dxa" w:w="100"/>
+            </w:tcMar>
+          </w:tcPr>
+          <w:p>
+            <w:pPr>
+              <w:jc w:val="left"/>
+            </w:pPr>
+            <w:r>
+              <w:rPr>
+                <w:rFonts w:ascii="Calibri" w:cs="Calibri" w:eastAsia="Calibri" w:hAnsi="Calibri"/>
+                <w:color w:val="1F2328"/>
+              </w:rPr>
+              <w:t xml:space="preserve">The Playlist Finds You</w:t>
+            </w:r>
+          </w:p>
+        </w:tc>
+        <w:tc>
+          <w:tcPr>
+            <w:tcW w:type="dxa" w:w="1560"/>
+            <w:tcBorders>
+              <w:top w:val="single" w:color="D0D7DE" w:sz="4"/>
+              <w:left w:val="single" w:color="D0D7DE" w:sz="4"/>
+              <w:bottom w:val="single" w:color="D0D7DE" w:sz="4"/>
+              <w:right w:val="single" w:color="D0D7DE" w:sz="4"/>
+            </w:tcBorders>
+            <w:tcMar>
+              <w:top w:type="dxa" w:w="60"/>
+              <w:left w:type="dxa" w:w="100"/>
+              <w:bottom w:type="dxa" w:w="60"/>
+              <w:right w:type="dxa" w:w="100"/>
+            </w:tcMar>
+          </w:tcPr>
+          <w:p>
+            <w:pPr>
+              <w:jc w:val="center"/>
+            </w:pPr>
+            <w:r>
+              <w:rPr>
+                <w:rFonts w:ascii="Calibri" w:cs="Calibri" w:eastAsia="Calibri" w:hAnsi="Calibri"/>
+                <w:color w:val="1F2328"/>
+              </w:rPr>
+              <w:t xml:space="preserve">djmaithai</w:t>
+            </w:r>
+          </w:p>
+        </w:tc>
+        <w:tc>
+          <w:tcPr>
+            <w:tcW w:type="dxa" w:w="1560"/>
+            <w:tcBorders>
+              <w:top w:val="single" w:color="D0D7DE" w:sz="4"/>
+              <w:left w:val="single" w:color="D0D7DE" w:sz="4"/>
+              <w:bottom w:val="single" w:color="D0D7DE" w:sz="4"/>
+              <w:right w:val="single" w:color="D0D7DE" w:sz="4"/>
+            </w:tcBorders>
+            <w:tcMar>
+              <w:top w:type="dxa" w:w="60"/>
+              <w:left w:type="dxa" w:w="100"/>
+              <w:bottom w:type="dxa" w:w="60"/>
+              <w:right w:type="dxa" w:w="100"/>
+            </w:tcMar>
+          </w:tcPr>
+          <w:p>
+            <w:pPr>
+              <w:jc w:val="center"/>
+            </w:pPr>
+            <w:r>
+              <w:rPr>
+                <w:rFonts w:ascii="Calibri" w:cs="Calibri" w:eastAsia="Calibri" w:hAnsi="Calibri"/>
+                <w:color w:val="1F2328"/>
+              </w:rPr>
+              <w:t xml:space="preserve">58 min</w:t>
+            </w:r>
+          </w:p>
+        </w:tc>
+        <w:tc>
+          <w:tcPr>
+            <w:tcW w:type="dxa" w:w="1560"/>
+            <w:tcBorders>
+              <w:top w:val="single" w:color="D0D7DE" w:sz="4"/>
+              <w:left w:val="single" w:color="D0D7DE" w:sz="4"/>
+              <w:bottom w:val="single" w:color="D0D7DE" w:sz="4"/>
+              <w:right w:val="single" w:color="D0D7DE" w:sz="4"/>
+            </w:tcBorders>
+            <w:tcMar>
+              <w:top w:type="dxa" w:w="60"/>
+              <w:left w:type="dxa" w:w="100"/>
+              <w:bottom w:type="dxa" w:w="60"/>
+              <w:right w:type="dxa" w:w="100"/>
+            </w:tcMar>
+          </w:tcPr>
+          <w:p>
+            <w:pPr>
+              <w:jc w:val="center"/>
+            </w:pPr>
+            <w:r>
+              <w:rPr>
+                <w:rFonts w:ascii="Calibri" w:cs="Calibri" w:eastAsia="Calibri" w:hAnsi="Calibri"/>
+                <w:color w:val="1F2328"/>
+              </w:rPr>
+              <w:t xml:space="preserve">2</w:t>
+            </w:r>
+          </w:p>
+        </w:tc>
+      </w:tr>
+    </w:tbl>
+    <w:p>
+      <w:pPr>
+        <w:spacing w:after="80"/>
+      </w:pPr>
+    </w:p>
+    <w:p>
+      <w:pPr>
+        <w:pBdr>
+          <w:bottom w:val="single" w:color="D0D7DE" w:sz="4" w:space="1"/>
+        </w:pBdr>
+        <w:spacing w:after="160" w:before="80"/>
+      </w:pPr>
+    </w:p>
+    <w:p>
+      <w:pPr>
+        <w:pStyle w:val="Heading1"/>
+        <w:spacing w:after="120" w:before="280"/>
+      </w:pPr>
+      <w:r>
+        <w:rPr>
+          <w:rFonts w:ascii="Calibri" w:cs="Calibri" w:eastAsia="Calibri" w:hAnsi="Calibri"/>
+          <w:b/>
+          <w:bCs/>
+          <w:color w:val="C8102E"/>
+          <w:sz w:val="32"/>
+          <w:szCs w:val="32"/>
+        </w:rPr>
         <w:t xml:space="preserve">Technical (for the repository)</w:t>
       </w:r>
     </w:p>
@@ -1710,7 +2659,168 @@
           <w:rFonts w:ascii="Calibri" w:cs="Calibri" w:eastAsia="Calibri" w:hAnsi="Calibri"/>
           <w:color w:val="1F2328"/>
         </w:rPr>
-        <w:t xml:space="preserve">Tests: 240 Node and 74 Python.</w:t>
+        <w:t xml:space="preserve">Quick patch: </w:t>
+      </w:r>
+      <w:r>
+        <w:rPr>
+          <w:rFonts w:ascii="Consolas" w:cs="Consolas" w:eastAsia="Consolas" w:hAnsi="Consolas"/>
+          <w:color w:val="0B5394"/>
+          <w:sz w:val="19"/>
+          <w:szCs w:val="19"/>
+        </w:rPr>
+        <w:t xml:space="preserve">server/progression.py</w:t>
+      </w:r>
+      <w:r>
+        <w:rPr>
+          <w:rFonts w:ascii="Calibri" w:cs="Calibri" w:eastAsia="Calibri" w:hAnsi="Calibri"/>
+          <w:color w:val="1F2328"/>
+        </w:rPr>
+        <w:t xml:space="preserve"> (</w:t>
+      </w:r>
+      <w:r>
+        <w:rPr>
+          <w:rFonts w:ascii="Consolas" w:cs="Consolas" w:eastAsia="Consolas" w:hAnsi="Consolas"/>
+          <w:color w:val="0B5394"/>
+          <w:sz w:val="19"/>
+          <w:szCs w:val="19"/>
+        </w:rPr>
+        <w:t xml:space="preserve">BADGES</w:t>
+      </w:r>
+      <w:r>
+        <w:rPr>
+          <w:rFonts w:ascii="Calibri" w:cs="Calibri" w:eastAsia="Calibri" w:hAnsi="Calibri"/>
+          <w:color w:val="1F2328"/>
+        </w:rPr>
+        <w:t xml:space="preserve"> handles_for_days and deadeye tiers; </w:t>
+      </w:r>
+      <w:r>
+        <w:rPr>
+          <w:rFonts w:ascii="Consolas" w:cs="Consolas" w:eastAsia="Consolas" w:hAnsi="Consolas"/>
+          <w:color w:val="0B5394"/>
+          <w:sz w:val="19"/>
+          <w:szCs w:val="19"/>
+        </w:rPr>
+        <w:t xml:space="preserve">apply_progress</w:t>
+      </w:r>
+      <w:r>
+        <w:rPr>
+          <w:rFonts w:ascii="Calibri" w:cs="Calibri" w:eastAsia="Calibri" w:hAnsi="Calibri"/>
+          <w:color w:val="1F2328"/>
+        </w:rPr>
+        <w:t xml:space="preserve"> also moves up a badge whose progress already meets a lower requirement), </w:t>
+      </w:r>
+      <w:r>
+        <w:rPr>
+          <w:rFonts w:ascii="Consolas" w:cs="Consolas" w:eastAsia="Consolas" w:hAnsi="Consolas"/>
+          <w:color w:val="0B5394"/>
+          <w:sz w:val="19"/>
+          <w:szCs w:val="19"/>
+        </w:rPr>
+        <w:t xml:space="preserve">client/js/ui/modes.js</w:t>
+      </w:r>
+      <w:r>
+        <w:rPr>
+          <w:rFonts w:ascii="Calibri" w:cs="Calibri" w:eastAsia="Calibri" w:hAnsi="Calibri"/>
+          <w:color w:val="1F2328"/>
+        </w:rPr>
+        <w:t xml:space="preserve"> and </w:t>
+      </w:r>
+      <w:r>
+        <w:rPr>
+          <w:rFonts w:ascii="Consolas" w:cs="Consolas" w:eastAsia="Consolas" w:hAnsi="Consolas"/>
+          <w:color w:val="0B5394"/>
+          <w:sz w:val="19"/>
+          <w:szCs w:val="19"/>
+        </w:rPr>
+        <w:t xml:space="preserve">client/css/menus.css</w:t>
+      </w:r>
+      <w:r>
+        <w:rPr>
+          <w:rFonts w:ascii="Calibri" w:cs="Calibri" w:eastAsia="Calibri" w:hAnsi="Calibri"/>
+          <w:color w:val="1F2328"/>
+        </w:rPr>
+        <w:t xml:space="preserve"> (the results' badge line as before), </w:t>
+      </w:r>
+      <w:r>
+        <w:rPr>
+          <w:rFonts w:ascii="Consolas" w:cs="Consolas" w:eastAsia="Consolas" w:hAnsi="Consolas"/>
+          <w:color w:val="0B5394"/>
+          <w:sz w:val="19"/>
+          <w:szCs w:val="19"/>
+        </w:rPr>
+        <w:t xml:space="preserve">client/audio/music/</w:t>
+      </w:r>
+      <w:r>
+        <w:rPr>
+          <w:rFonts w:ascii="Calibri" w:cs="Calibri" w:eastAsia="Calibri" w:hAnsi="Calibri"/>
+          <w:color w:val="1F2328"/>
+        </w:rPr>
+        <w:t xml:space="preserve"> (18 new parts, </w:t>
+      </w:r>
+      <w:r>
+        <w:rPr>
+          <w:rFonts w:ascii="Consolas" w:cs="Consolas" w:eastAsia="Consolas" w:hAnsi="Consolas"/>
+          <w:color w:val="0B5394"/>
+          <w:sz w:val="19"/>
+          <w:szCs w:val="19"/>
+        </w:rPr>
+        <w:t xml:space="preserve">tracks.json</w:t>
+      </w:r>
+      <w:r>
+        <w:rPr>
+          <w:rFonts w:ascii="Calibri" w:cs="Calibri" w:eastAsia="Calibri" w:hAnsi="Calibri"/>
+          <w:color w:val="1F2328"/>
+        </w:rPr>
+        <w:t xml:space="preserve">), tests (</w:t>
+      </w:r>
+      <w:r>
+        <w:rPr>
+          <w:rFonts w:ascii="Consolas" w:cs="Consolas" w:eastAsia="Consolas" w:hAnsi="Consolas"/>
+          <w:color w:val="0B5394"/>
+          <w:sz w:val="19"/>
+          <w:szCs w:val="19"/>
+        </w:rPr>
+        <w:t xml:space="preserve">test_server.py</w:t>
+      </w:r>
+      <w:r>
+        <w:rPr>
+          <w:rFonts w:ascii="Calibri" w:cs="Calibri" w:eastAsia="Calibri" w:hAnsi="Calibri"/>
+          <w:color w:val="1F2328"/>
+        </w:rPr>
+        <w:t xml:space="preserve">: two Pro Run games through the service, the new Hall of Fame marks; </w:t>
+      </w:r>
+      <w:r>
+        <w:rPr>
+          <w:rFonts w:ascii="Consolas" w:cs="Consolas" w:eastAsia="Consolas" w:hAnsi="Consolas"/>
+          <w:color w:val="0B5394"/>
+          <w:sz w:val="19"/>
+          <w:szCs w:val="19"/>
+        </w:rPr>
+        <w:t xml:space="preserve">v048.test.mjs</w:t>
+      </w:r>
+      <w:r>
+        <w:rPr>
+          <w:rFonts w:ascii="Calibri" w:cs="Calibri" w:eastAsia="Calibri" w:hAnsi="Calibri"/>
+          <w:color w:val="1F2328"/>
+        </w:rPr>
+        <w:t xml:space="preserve">: the new mixes).</w:t>
+      </w:r>
+    </w:p>
+    <w:p>
+      <w:pPr>
+        <w:pStyle w:val="ListParagraph"/>
+        <w:numPr>
+          <w:ilvl w:val="0"/>
+          <w:numId w:val="2"/>
+        </w:numPr>
+        <w:spacing w:after="80" w:line="276"/>
+      </w:pPr>
+      <w:r>
+        <w:rPr>
+          <w:rFonts w:ascii="Calibri" w:cs="Calibri" w:eastAsia="Calibri" w:hAnsi="Calibri"/>
+          <w:color w:val="1F2328"/>
+        </w:rPr>
+        <w:t xml:space="preserve">Tests: 241 Node and 75 Python.</w:t>
       </w:r>
     </w:p>
     <w:sectPr>

</xml_diff>

<commit_message>
Sharp-Eye + Take-It-Back [QP]
</commit_message>
<xml_diff>
--- a/PATCH_NOTES_v0.4.8.docx
+++ b/PATCH_NOTES_v0.4.8.docx
@@ -2512,6 +2512,412 @@
           <w:sz w:val="32"/>
           <w:szCs w:val="32"/>
         </w:rPr>
+        <w:t xml:space="preserve">Quick patch 2 (Oct 13)</w:t>
+      </w:r>
+    </w:p>
+    <w:p>
+      <w:pPr>
+        <w:pStyle w:val="Heading2"/>
+        <w:spacing w:after="80" w:before="200"/>
+      </w:pPr>
+      <w:r>
+        <w:rPr>
+          <w:rFonts w:ascii="Calibri" w:cs="Calibri" w:eastAsia="Calibri" w:hAnsi="Calibri"/>
+          <w:b/>
+          <w:bCs/>
+          <w:color w:val="1F2328"/>
+          <w:sz w:val="26"/>
+          <w:szCs w:val="26"/>
+        </w:rPr>
+        <w:t xml:space="preserve">Take it back (1v1 and 2v2 courts)</w:t>
+      </w:r>
+    </w:p>
+    <w:p>
+      <w:pPr>
+        <w:pStyle w:val="ListParagraph"/>
+        <w:numPr>
+          <w:ilvl w:val="0"/>
+          <w:numId w:val="2"/>
+        </w:numPr>
+        <w:spacing w:after="80" w:line="276"/>
+      </w:pPr>
+      <w:r>
+        <w:rPr>
+          <w:rFonts w:ascii="Calibri" w:cs="Calibri" w:eastAsia="Calibri" w:hAnsi="Calibri"/>
+          <w:b/>
+          <w:bCs/>
+          <w:color w:val="1F2328"/>
+        </w:rPr>
+        <w:t xml:space="preserve">The arc lights up after every change of hands.</w:t>
+      </w:r>
+      <w:r>
+        <w:rPr>
+          <w:rFonts w:ascii="Calibri" w:cs="Calibri" w:eastAsia="Calibri" w:hAnsi="Calibri"/>
+          <w:color w:val="1F2328"/>
+        </w:rPr>
+        <w:t xml:space="preserve"> In half-court games, a defensive rebound, a pass picked off, a steal or a loose ball the defense comes up with now all mean the ball has to go back behind the three-point line, and the red glow runs along the line until it does. Before, only a clean steal set it off, because a rebound or a catch changed hands without the rule. An offensive rebound still doesn't need clearing.</w:t>
+      </w:r>
+    </w:p>
+    <w:p>
+      <w:pPr>
+        <w:pStyle w:val="ListParagraph"/>
+        <w:numPr>
+          <w:ilvl w:val="0"/>
+          <w:numId w:val="2"/>
+        </w:numPr>
+        <w:spacing w:after="80" w:line="276"/>
+      </w:pPr>
+      <w:r>
+        <w:rPr>
+          <w:rFonts w:ascii="Calibri" w:cs="Calibri" w:eastAsia="Calibri" w:hAnsi="Calibri"/>
+          <w:b/>
+          <w:bCs/>
+          <w:color w:val="1F2328"/>
+        </w:rPr>
+        <w:t xml:space="preserve">No shot until it's cleared.</w:t>
+      </w:r>
+      <w:r>
+        <w:rPr>
+          <w:rFonts w:ascii="Calibri" w:cs="Calibri" w:eastAsia="Calibri" w:hAnsi="Calibri"/>
+          <w:color w:val="1F2328"/>
+        </w:rPr>
+        <w:t xml:space="preserve"> Pressing shoot (or attack) before the ball is behind the arc does nothing but call out </w:t>
+      </w:r>
+      <w:r>
+        <w:rPr>
+          <w:rFonts w:ascii="Calibri" w:cs="Calibri" w:eastAsia="Calibri" w:hAnsi="Calibri"/>
+          <w:b/>
+          <w:bCs/>
+          <w:color w:val="1F2328"/>
+        </w:rPr>
+        <w:t xml:space="preserve">TAKE IT BACK</w:t>
+      </w:r>
+      <w:r>
+        <w:rPr>
+          <w:rFonts w:ascii="Calibri" w:cs="Calibri" w:eastAsia="Calibri" w:hAnsi="Calibri"/>
+          <w:color w:val="1F2328"/>
+        </w:rPr>
+        <w:t xml:space="preserve">, and the arc flares up. A lob thrown for an alley-oop before the clear goes up as a plain lob, and it can't be finished as an oop. Passes and dribble moves work as normal while you take it back. The old safety net stays in place: a basket that somehow goes in without the clear is still waved off.</w:t>
+      </w:r>
+    </w:p>
+    <w:p>
+      <w:pPr>
+        <w:pStyle w:val="ListParagraph"/>
+        <w:numPr>
+          <w:ilvl w:val="0"/>
+          <w:numId w:val="2"/>
+        </w:numPr>
+        <w:spacing w:after="80" w:line="276"/>
+      </w:pPr>
+      <w:r>
+        <w:rPr>
+          <w:rFonts w:ascii="Calibri" w:cs="Calibri" w:eastAsia="Calibri" w:hAnsi="Calibri"/>
+          <w:b/>
+          <w:bCs/>
+          <w:color w:val="1F2328"/>
+        </w:rPr>
+        <w:t xml:space="preserve">The AI takes it back too.</w:t>
+      </w:r>
+      <w:r>
+        <w:rPr>
+          <w:rFonts w:ascii="Calibri" w:cs="Calibri" w:eastAsia="Calibri" w:hAnsi="Calibri"/>
+          <w:color w:val="1F2328"/>
+        </w:rPr>
+        <w:t xml:space="preserve"> In 1v1 and 2v2 games played out to the end, neither side ever started a shot before clearing.</w:t>
+      </w:r>
+    </w:p>
+    <w:p>
+      <w:pPr>
+        <w:pStyle w:val="ListParagraph"/>
+        <w:numPr>
+          <w:ilvl w:val="0"/>
+          <w:numId w:val="2"/>
+        </w:numPr>
+        <w:spacing w:after="80" w:line="276"/>
+      </w:pPr>
+      <w:r>
+        <w:rPr>
+          <w:rFonts w:ascii="Calibri" w:cs="Calibri" w:eastAsia="Calibri" w:hAnsi="Calibri"/>
+          <w:color w:val="1F2328"/>
+        </w:rPr>
+        <w:t xml:space="preserve">The 3v3 courts are full-court games, so the rule doesn't apply there.</w:t>
+      </w:r>
+    </w:p>
+    <w:p>
+      <w:pPr>
+        <w:pStyle w:val="Heading2"/>
+        <w:spacing w:after="80" w:before="200"/>
+      </w:pPr>
+      <w:r>
+        <w:rPr>
+          <w:rFonts w:ascii="Calibri" w:cs="Calibri" w:eastAsia="Calibri" w:hAnsi="Calibri"/>
+          <w:b/>
+          <w:bCs/>
+          <w:color w:val="1F2328"/>
+          <w:sz w:val="26"/>
+          <w:szCs w:val="26"/>
+        </w:rPr>
+        <w:t xml:space="preserve">Sharp Eye (the Sharpshooter Icon badge)</w:t>
+      </w:r>
+    </w:p>
+    <w:p>
+      <w:pPr>
+        <w:pStyle w:val="ListParagraph"/>
+        <w:numPr>
+          <w:ilvl w:val="0"/>
+          <w:numId w:val="2"/>
+        </w:numPr>
+        <w:spacing w:after="80" w:line="276"/>
+      </w:pPr>
+      <w:r>
+        <w:rPr>
+          <w:rFonts w:ascii="Calibri" w:cs="Calibri" w:eastAsia="Calibri" w:hAnsi="Calibri"/>
+          <w:b/>
+          <w:bCs/>
+          <w:color w:val="1F2328"/>
+        </w:rPr>
+        <w:t xml:space="preserve">5% bigger green window on every shot, everywhere on the court.</w:t>
+      </w:r>
+      <w:r>
+        <w:rPr>
+          <w:rFonts w:ascii="Calibri" w:cs="Calibri" w:eastAsia="Calibri" w:hAnsi="Calibri"/>
+          <w:color w:val="1F2328"/>
+        </w:rPr>
+        <w:t xml:space="preserve"> This was already in place for jumpers, free throws and layups. It now also counts on the hardest shots, where the window had bottomed out at its minimum. When a green only happened thanks to that 5%, the Sharp Eye badge pops up so you can see it working. A smothered shot still has no window at all, whatever adds to it.</w:t>
+      </w:r>
+    </w:p>
+    <w:p>
+      <w:pPr>
+        <w:pStyle w:val="ListParagraph"/>
+        <w:numPr>
+          <w:ilvl w:val="0"/>
+          <w:numId w:val="2"/>
+        </w:numPr>
+        <w:spacing w:after="80" w:line="276"/>
+      </w:pPr>
+      <w:r>
+        <w:rPr>
+          <w:rFonts w:ascii="Calibri" w:cs="Calibri" w:eastAsia="Calibri" w:hAnsi="Calibri"/>
+          <w:b/>
+          <w:bCs/>
+          <w:color w:val="1F2328"/>
+        </w:rPr>
+        <w:t xml:space="preserve">The Sharp Eye jumpshot package, for the holder alone:</w:t>
+      </w:r>
+    </w:p>
+    <w:p>
+      <w:pPr>
+        <w:pStyle w:val="ListParagraph"/>
+        <w:numPr>
+          <w:ilvl w:val="1"/>
+          <w:numId w:val="2"/>
+        </w:numPr>
+        <w:spacing w:after="80" w:line="276"/>
+      </w:pPr>
+      <w:r>
+        <w:rPr>
+          <w:rFonts w:ascii="Calibri" w:cs="Calibri" w:eastAsia="Calibri" w:hAnsi="Calibri"/>
+          <w:b/>
+          <w:bCs/>
+          <w:color w:val="1F2328"/>
+        </w:rPr>
+        <w:t xml:space="preserve">Jumpshot Base: Sharp Eye.</w:t>
+      </w:r>
+      <w:r>
+        <w:rPr>
+          <w:rFonts w:ascii="Calibri" w:cs="Calibri" w:eastAsia="Calibri" w:hAnsi="Calibri"/>
+          <w:color w:val="1F2328"/>
+        </w:rPr>
+        <w:t xml:space="preserve"> An effortless quick hop: barely a dip, feet together, and up higher than any other base in the game. It's the quickest base there is, and the ball goes right at the very top of the jump.</w:t>
+      </w:r>
+    </w:p>
+    <w:p>
+      <w:pPr>
+        <w:pStyle w:val="ListParagraph"/>
+        <w:numPr>
+          <w:ilvl w:val="1"/>
+          <w:numId w:val="2"/>
+        </w:numPr>
+        <w:spacing w:after="80" w:line="276"/>
+      </w:pPr>
+      <w:r>
+        <w:rPr>
+          <w:rFonts w:ascii="Calibri" w:cs="Calibri" w:eastAsia="Calibri" w:hAnsi="Calibri"/>
+          <w:b/>
+          <w:bCs/>
+          <w:color w:val="1F2328"/>
+        </w:rPr>
+        <w:t xml:space="preserve">Sharp Eye Release.</w:t>
+      </w:r>
+      <w:r>
+        <w:rPr>
+          <w:rFonts w:ascii="Calibri" w:cs="Calibri" w:eastAsia="Calibri" w:hAnsi="Calibri"/>
+          <w:color w:val="1F2328"/>
+        </w:rPr>
+        <w:t xml:space="preserve"> Butter at the apex: both wrists arch all the way over, like a crane dipping into a bucket, eased into slowly and held all the way down.</w:t>
+      </w:r>
+    </w:p>
+    <w:p>
+      <w:pPr>
+        <w:pStyle w:val="ListParagraph"/>
+        <w:numPr>
+          <w:ilvl w:val="1"/>
+          <w:numId w:val="2"/>
+        </w:numPr>
+        <w:spacing w:after="80" w:line="276"/>
+      </w:pPr>
+      <w:r>
+        <w:rPr>
+          <w:rFonts w:ascii="Calibri" w:cs="Calibri" w:eastAsia="Calibri" w:hAnsi="Calibri"/>
+          <w:b/>
+          <w:bCs/>
+          <w:color w:val="1F2328"/>
+        </w:rPr>
+        <w:t xml:space="preserve">The backflip.</w:t>
+      </w:r>
+      <w:r>
+        <w:rPr>
+          <w:rFonts w:ascii="Calibri" w:cs="Calibri" w:eastAsia="Calibri" w:hAnsi="Calibri"/>
+          <w:color w:val="1F2328"/>
+        </w:rPr>
+        <w:t xml:space="preserve"> A green jumper of yours that goes in is followed by a backflip as soon as you're back on the floor. It happens on every screen in online games too.</w:t>
+      </w:r>
+    </w:p>
+    <w:p>
+      <w:pPr>
+        <w:pStyle w:val="ListParagraph"/>
+        <w:numPr>
+          <w:ilvl w:val="0"/>
+          <w:numId w:val="2"/>
+        </w:numPr>
+        <w:spacing w:after="80" w:line="276"/>
+      </w:pPr>
+      <w:r>
+        <w:rPr>
+          <w:rFonts w:ascii="Calibri" w:cs="Calibri" w:eastAsia="Calibri" w:hAnsi="Calibri"/>
+          <w:b/>
+          <w:bCs/>
+          <w:color w:val="1F2328"/>
+        </w:rPr>
+        <w:t xml:space="preserve">Only that build ever sees them.</w:t>
+      </w:r>
+      <w:r>
+        <w:rPr>
+          <w:rFonts w:ascii="Calibri" w:cs="Calibri" w:eastAsia="Calibri" w:hAnsi="Calibri"/>
+          <w:color w:val="1F2328"/>
+        </w:rPr>
+        <w:t xml:space="preserve"> They're never in the store or anywhere else, and they can't be bought. They show in the Inventory (and My Player's animations) only for the build that holds Sharp Eye. Another build on the same account can't see them or put them on.</w:t>
+      </w:r>
+    </w:p>
+    <w:p>
+      <w:pPr>
+        <w:pStyle w:val="ListParagraph"/>
+        <w:numPr>
+          <w:ilvl w:val="0"/>
+          <w:numId w:val="2"/>
+        </w:numPr>
+        <w:spacing w:after="80" w:line="276"/>
+      </w:pPr>
+      <w:r>
+        <w:rPr>
+          <w:rFonts w:ascii="Calibri" w:cs="Calibri" w:eastAsia="Calibri" w:hAnsi="Calibri"/>
+          <w:b/>
+          <w:bCs/>
+          <w:color w:val="1F2328"/>
+        </w:rPr>
+        <w:t xml:space="preserve">Getting them:</w:t>
+      </w:r>
+    </w:p>
+    <w:p>
+      <w:pPr>
+        <w:pStyle w:val="ListParagraph"/>
+        <w:numPr>
+          <w:ilvl w:val="1"/>
+          <w:numId w:val="2"/>
+        </w:numPr>
+        <w:spacing w:after="80" w:line="276"/>
+      </w:pPr>
+      <w:r>
+        <w:rPr>
+          <w:rFonts w:ascii="Calibri" w:cs="Calibri" w:eastAsia="Calibri" w:hAnsi="Calibri"/>
+          <w:color w:val="1F2328"/>
+        </w:rPr>
+        <w:t xml:space="preserve">They're put on the moment the badge unlocks.</w:t>
+      </w:r>
+    </w:p>
+    <w:p>
+      <w:pPr>
+        <w:pStyle w:val="ListParagraph"/>
+        <w:numPr>
+          <w:ilvl w:val="1"/>
+          <w:numId w:val="2"/>
+        </w:numPr>
+        <w:spacing w:after="80" w:line="276"/>
+      </w:pPr>
+      <w:r>
+        <w:rPr>
+          <w:rFonts w:ascii="Calibri" w:cs="Calibri" w:eastAsia="Calibri" w:hAnsi="Calibri"/>
+          <w:color w:val="1F2328"/>
+        </w:rPr>
+        <w:t xml:space="preserve">A build that already holds Sharp Eye gets them put on once, the next time the game loads. You can switch back to your own jumper in the Inventory.</w:t>
+      </w:r>
+    </w:p>
+    <w:p>
+      <w:pPr>
+        <w:pStyle w:val="ListParagraph"/>
+        <w:numPr>
+          <w:ilvl w:val="1"/>
+          <w:numId w:val="2"/>
+        </w:numPr>
+        <w:spacing w:after="80" w:line="276"/>
+      </w:pPr>
+      <w:r>
+        <w:rPr>
+          <w:rFonts w:ascii="Calibri" w:cs="Calibri" w:eastAsia="Calibri" w:hAnsi="Calibri"/>
+          <w:color w:val="1F2328"/>
+        </w:rPr>
+        <w:t xml:space="preserve">An AI Sharp Eye holder shoots the package as well.</w:t>
+      </w:r>
+    </w:p>
+    <w:p>
+      <w:pPr>
+        <w:pStyle w:val="ListParagraph"/>
+        <w:numPr>
+          <w:ilvl w:val="0"/>
+          <w:numId w:val="2"/>
+        </w:numPr>
+        <w:spacing w:after="80" w:line="276"/>
+      </w:pPr>
+      <w:r>
+        <w:rPr>
+          <w:rFonts w:ascii="Calibri" w:cs="Calibri" w:eastAsia="Calibri" w:hAnsi="Calibri"/>
+          <w:color w:val="1F2328"/>
+        </w:rPr>
+        <w:t xml:space="preserve">The Icon badge's description now names what it unlocks. (The old "flashy" touches it used to add to any jumper are replaced by the package.)</w:t>
+      </w:r>
+    </w:p>
+    <w:p>
+      <w:pPr>
+        <w:pBdr>
+          <w:bottom w:val="single" w:color="D0D7DE" w:sz="4" w:space="1"/>
+        </w:pBdr>
+        <w:spacing w:after="160" w:before="80"/>
+      </w:pPr>
+    </w:p>
+    <w:p>
+      <w:pPr>
+        <w:pStyle w:val="Heading1"/>
+        <w:spacing w:after="120" w:before="280"/>
+      </w:pPr>
+      <w:r>
+        <w:rPr>
+          <w:rFonts w:ascii="Calibri" w:cs="Calibri" w:eastAsia="Calibri" w:hAnsi="Calibri"/>
+          <w:b/>
+          <w:bCs/>
+          <w:color w:val="C8102E"/>
+          <w:sz w:val="32"/>
+          <w:szCs w:val="32"/>
+        </w:rPr>
         <w:t xml:space="preserve">Technical (for the repository)</w:t>
       </w:r>
     </w:p>
@@ -2820,7 +3226,616 @@
           <w:rFonts w:ascii="Calibri" w:cs="Calibri" w:eastAsia="Calibri" w:hAnsi="Calibri"/>
           <w:color w:val="1F2328"/>
         </w:rPr>
-        <w:t xml:space="preserve">Tests: 241 Node and 75 Python.</w:t>
+        <w:t xml:space="preserve">Quick patch 2: </w:t>
+      </w:r>
+      <w:r>
+        <w:rPr>
+          <w:rFonts w:ascii="Consolas" w:cs="Consolas" w:eastAsia="Consolas" w:hAnsi="Consolas"/>
+          <w:color w:val="0B5394"/>
+          <w:sz w:val="19"/>
+          <w:szCs w:val="19"/>
+        </w:rPr>
+        <w:t xml:space="preserve">client/js/sim/game.js</w:t>
+      </w:r>
+      <w:r>
+        <w:rPr>
+          <w:rFonts w:ascii="Calibri" w:cs="Calibri" w:eastAsia="Calibri" w:hAnsi="Calibri"/>
+          <w:color w:val="1F2328"/>
+        </w:rPr>
+        <w:t xml:space="preserve"> (</w:t>
+      </w:r>
+      <w:r>
+        <w:rPr>
+          <w:rFonts w:ascii="Consolas" w:cs="Consolas" w:eastAsia="Consolas" w:hAnsi="Consolas"/>
+          <w:color w:val="0B5394"/>
+          <w:sz w:val="19"/>
+          <w:szCs w:val="19"/>
+        </w:rPr>
+        <w:t xml:space="preserve">catchBall</w:t>
+      </w:r>
+      <w:r>
+        <w:rPr>
+          <w:rFonts w:ascii="Calibri" w:cs="Calibri" w:eastAsia="Calibri" w:hAnsi="Calibri"/>
+          <w:color w:val="1F2328"/>
+        </w:rPr>
+        <w:t xml:space="preserve"> changes hands through </w:t>
+      </w:r>
+      <w:r>
+        <w:rPr>
+          <w:rFonts w:ascii="Consolas" w:cs="Consolas" w:eastAsia="Consolas" w:hAnsi="Consolas"/>
+          <w:color w:val="0B5394"/>
+          <w:sz w:val="19"/>
+          <w:szCs w:val="19"/>
+        </w:rPr>
+        <w:t xml:space="preserve">changePossessionTo</w:t>
+      </w:r>
+      <w:r>
+        <w:rPr>
+          <w:rFonts w:ascii="Calibri" w:cs="Calibri" w:eastAsia="Calibri" w:hAnsi="Calibri"/>
+          <w:color w:val="1F2328"/>
+        </w:rPr>
+        <w:t xml:space="preserve">; </w:t>
+      </w:r>
+      <w:r>
+        <w:rPr>
+          <w:rFonts w:ascii="Consolas" w:cs="Consolas" w:eastAsia="Consolas" w:hAnsi="Consolas"/>
+          <w:color w:val="0B5394"/>
+          <w:sz w:val="19"/>
+          <w:szCs w:val="19"/>
+        </w:rPr>
+        <w:t xml:space="preserve">mustClear</w:t>
+      </w:r>
+      <w:r>
+        <w:rPr>
+          <w:rFonts w:ascii="Calibri" w:cs="Calibri" w:eastAsia="Calibri" w:hAnsi="Calibri"/>
+          <w:color w:val="1F2328"/>
+        </w:rPr>
+        <w:t xml:space="preserve">/</w:t>
+      </w:r>
+      <w:r>
+        <w:rPr>
+          <w:rFonts w:ascii="Consolas" w:cs="Consolas" w:eastAsia="Consolas" w:hAnsi="Consolas"/>
+          <w:color w:val="0B5394"/>
+          <w:sz w:val="19"/>
+          <w:szCs w:val="19"/>
+        </w:rPr>
+        <w:t xml:space="preserve">clearFirst</w:t>
+      </w:r>
+      <w:r>
+        <w:rPr>
+          <w:rFonts w:ascii="Calibri" w:cs="Calibri" w:eastAsia="Calibri" w:hAnsi="Calibri"/>
+          <w:color w:val="1F2328"/>
+        </w:rPr>
+        <w:t xml:space="preserve"> hold back shots and alley-oops; </w:t>
+      </w:r>
+      <w:r>
+        <w:rPr>
+          <w:rFonts w:ascii="Consolas" w:cs="Consolas" w:eastAsia="Consolas" w:hAnsi="Consolas"/>
+          <w:color w:val="0B5394"/>
+          <w:sz w:val="19"/>
+          <w:szCs w:val="19"/>
+        </w:rPr>
+        <w:t xml:space="preserve">FLIP</w:t>
+      </w:r>
+      <w:r>
+        <w:rPr>
+          <w:rFonts w:ascii="Calibri" w:cs="Calibri" w:eastAsia="Calibri" w:hAnsi="Calibri"/>
+          <w:color w:val="1F2328"/>
+        </w:rPr>
+        <w:t xml:space="preserve">, </w:t>
+      </w:r>
+      <w:r>
+        <w:rPr>
+          <w:rFonts w:ascii="Consolas" w:cs="Consolas" w:eastAsia="Consolas" w:hAnsi="Consolas"/>
+          <w:color w:val="0B5394"/>
+          <w:sz w:val="19"/>
+          <w:szCs w:val="19"/>
+        </w:rPr>
+        <w:t xml:space="preserve">startFlips</w:t>
+      </w:r>
+      <w:r>
+        <w:rPr>
+          <w:rFonts w:ascii="Calibri" w:cs="Calibri" w:eastAsia="Calibri" w:hAnsi="Calibri"/>
+          <w:color w:val="1F2328"/>
+        </w:rPr>
+        <w:t xml:space="preserve">, </w:t>
+      </w:r>
+      <w:r>
+        <w:rPr>
+          <w:rFonts w:ascii="Consolas" w:cs="Consolas" w:eastAsia="Consolas" w:hAnsi="Consolas"/>
+          <w:color w:val="0B5394"/>
+          <w:sz w:val="19"/>
+          <w:szCs w:val="19"/>
+        </w:rPr>
+        <w:t xml:space="preserve">flipsFor</w:t>
+      </w:r>
+      <w:r>
+        <w:rPr>
+          <w:rFonts w:ascii="Calibri" w:cs="Calibri" w:eastAsia="Calibri" w:hAnsi="Calibri"/>
+          <w:color w:val="1F2328"/>
+        </w:rPr>
+        <w:t xml:space="preserve">, the </w:t>
+      </w:r>
+      <w:r>
+        <w:rPr>
+          <w:rFonts w:ascii="Consolas" w:cs="Consolas" w:eastAsia="Consolas" w:hAnsi="Consolas"/>
+          <w:color w:val="0B5394"/>
+          <w:sz w:val="19"/>
+          <w:szCs w:val="19"/>
+        </w:rPr>
+        <w:t xml:space="preserve">flip</w:t>
+      </w:r>
+      <w:r>
+        <w:rPr>
+          <w:rFonts w:ascii="Calibri" w:cs="Calibri" w:eastAsia="Calibri" w:hAnsi="Calibri"/>
+          <w:color w:val="1F2328"/>
+        </w:rPr>
+        <w:t xml:space="preserve"> action; </w:t>
+      </w:r>
+      <w:r>
+        <w:rPr>
+          <w:rFonts w:ascii="Consolas" w:cs="Consolas" w:eastAsia="Consolas" w:hAnsi="Consolas"/>
+          <w:color w:val="0B5394"/>
+          <w:sz w:val="19"/>
+          <w:szCs w:val="19"/>
+        </w:rPr>
+        <w:t xml:space="preserve">sharpEyeSave</w:t>
+      </w:r>
+      <w:r>
+        <w:rPr>
+          <w:rFonts w:ascii="Calibri" w:cs="Calibri" w:eastAsia="Calibri" w:hAnsi="Calibri"/>
+          <w:color w:val="1F2328"/>
+        </w:rPr>
+        <w:t xml:space="preserve">; </w:t>
+      </w:r>
+      <w:r>
+        <w:rPr>
+          <w:rFonts w:ascii="Consolas" w:cs="Consolas" w:eastAsia="Consolas" w:hAnsi="Consolas"/>
+          <w:color w:val="0B5394"/>
+          <w:sz w:val="19"/>
+          <w:szCs w:val="19"/>
+        </w:rPr>
+        <w:t xml:space="preserve">SHOT_PATH.sharpeye</w:t>
+      </w:r>
+      <w:r>
+        <w:rPr>
+          <w:rFonts w:ascii="Calibri" w:cs="Calibri" w:eastAsia="Calibri" w:hAnsi="Calibri"/>
+          <w:color w:val="1F2328"/>
+        </w:rPr>
+        <w:t xml:space="preserve">; the takeoff at </w:t>
+      </w:r>
+      <w:r>
+        <w:rPr>
+          <w:rFonts w:ascii="Consolas" w:cs="Consolas" w:eastAsia="Consolas" w:hAnsi="Consolas"/>
+          <w:color w:val="0B5394"/>
+          <w:sz w:val="19"/>
+          <w:szCs w:val="19"/>
+        </w:rPr>
+        <w:t xml:space="preserve">apexK</w:t>
+      </w:r>
+      <w:r>
+        <w:rPr>
+          <w:rFonts w:ascii="Calibri" w:cs="Calibri" w:eastAsia="Calibri" w:hAnsi="Calibri"/>
+          <w:color w:val="1F2328"/>
+        </w:rPr>
+        <w:t xml:space="preserve">), </w:t>
+      </w:r>
+      <w:r>
+        <w:rPr>
+          <w:rFonts w:ascii="Consolas" w:cs="Consolas" w:eastAsia="Consolas" w:hAnsi="Consolas"/>
+          <w:color w:val="0B5394"/>
+          <w:sz w:val="19"/>
+          <w:szCs w:val="19"/>
+        </w:rPr>
+        <w:t xml:space="preserve">client/js/sim/shots.js</w:t>
+      </w:r>
+      <w:r>
+        <w:rPr>
+          <w:rFonts w:ascii="Calibri" w:cs="Calibri" w:eastAsia="Calibri" w:hAnsi="Calibri"/>
+          <w:color w:val="1F2328"/>
+        </w:rPr>
+        <w:t xml:space="preserve"> (</w:t>
+      </w:r>
+      <w:r>
+        <w:rPr>
+          <w:rFonts w:ascii="Consolas" w:cs="Consolas" w:eastAsia="Consolas" w:hAnsi="Consolas"/>
+          <w:color w:val="0B5394"/>
+          <w:sz w:val="19"/>
+          <w:szCs w:val="19"/>
+        </w:rPr>
+        <w:t xml:space="preserve">BASE_FEEL.sharpeye</w:t>
+      </w:r>
+      <w:r>
+        <w:rPr>
+          <w:rFonts w:ascii="Calibri" w:cs="Calibri" w:eastAsia="Calibri" w:hAnsi="Calibri"/>
+          <w:color w:val="1F2328"/>
+        </w:rPr>
+        <w:t xml:space="preserve">, </w:t>
+      </w:r>
+      <w:r>
+        <w:rPr>
+          <w:rFonts w:ascii="Consolas" w:cs="Consolas" w:eastAsia="Consolas" w:hAnsi="Consolas"/>
+          <w:color w:val="0B5394"/>
+          <w:sz w:val="19"/>
+          <w:szCs w:val="19"/>
+        </w:rPr>
+        <w:t xml:space="preserve">SHARP_EYE_PKG</w:t>
+      </w:r>
+      <w:r>
+        <w:rPr>
+          <w:rFonts w:ascii="Calibri" w:cs="Calibri" w:eastAsia="Calibri" w:hAnsi="Calibri"/>
+          <w:color w:val="1F2328"/>
+        </w:rPr>
+        <w:t xml:space="preserve">, </w:t>
+      </w:r>
+      <w:r>
+        <w:rPr>
+          <w:rFonts w:ascii="Consolas" w:cs="Consolas" w:eastAsia="Consolas" w:hAnsi="Consolas"/>
+          <w:color w:val="0B5394"/>
+          <w:sz w:val="19"/>
+          <w:szCs w:val="19"/>
+        </w:rPr>
+        <w:t xml:space="preserve">jumpshotPackage</w:t>
+      </w:r>
+      <w:r>
+        <w:rPr>
+          <w:rFonts w:ascii="Calibri" w:cs="Calibri" w:eastAsia="Calibri" w:hAnsi="Calibri"/>
+          <w:color w:val="1F2328"/>
+        </w:rPr>
+        <w:t xml:space="preserve"> plays an Icon's package only for its holder, the window floor scales with Sharp Eye), </w:t>
+      </w:r>
+      <w:r>
+        <w:rPr>
+          <w:rFonts w:ascii="Consolas" w:cs="Consolas" w:eastAsia="Consolas" w:hAnsi="Consolas"/>
+          <w:color w:val="0B5394"/>
+          <w:sz w:val="19"/>
+          <w:szCs w:val="19"/>
+        </w:rPr>
+        <w:t xml:space="preserve">client/js/sim/player.js</w:t>
+      </w:r>
+      <w:r>
+        <w:rPr>
+          <w:rFonts w:ascii="Calibri" w:cs="Calibri" w:eastAsia="Calibri" w:hAnsi="Calibri"/>
+          <w:color w:val="1F2328"/>
+        </w:rPr>
+        <w:t xml:space="preserve"> (AI holders shoot the package), </w:t>
+      </w:r>
+      <w:r>
+        <w:rPr>
+          <w:rFonts w:ascii="Consolas" w:cs="Consolas" w:eastAsia="Consolas" w:hAnsi="Consolas"/>
+          <w:color w:val="0B5394"/>
+          <w:sz w:val="19"/>
+          <w:szCs w:val="19"/>
+        </w:rPr>
+        <w:t xml:space="preserve">client/js/char/animator.js</w:t>
+      </w:r>
+      <w:r>
+        <w:rPr>
+          <w:rFonts w:ascii="Calibri" w:cs="Calibri" w:eastAsia="Calibri" w:hAnsi="Calibri"/>
+          <w:color w:val="1F2328"/>
+        </w:rPr>
+        <w:t xml:space="preserve"> (the base, the crane release, the backflip pose, </w:t>
+      </w:r>
+      <w:r>
+        <w:rPr>
+          <w:rFonts w:ascii="Consolas" w:cs="Consolas" w:eastAsia="Consolas" w:hAnsi="Consolas"/>
+          <w:color w:val="0B5394"/>
+          <w:sz w:val="19"/>
+          <w:szCs w:val="19"/>
+        </w:rPr>
+        <w:t xml:space="preserve">flipAngle</w:t>
+      </w:r>
+      <w:r>
+        <w:rPr>
+          <w:rFonts w:ascii="Calibri" w:cs="Calibri" w:eastAsia="Calibri" w:hAnsi="Calibri"/>
+          <w:color w:val="1F2328"/>
+        </w:rPr>
+        <w:t xml:space="preserve">), </w:t>
+      </w:r>
+      <w:r>
+        <w:rPr>
+          <w:rFonts w:ascii="Consolas" w:cs="Consolas" w:eastAsia="Consolas" w:hAnsi="Consolas"/>
+          <w:color w:val="0B5394"/>
+          <w:sz w:val="19"/>
+          <w:szCs w:val="19"/>
+        </w:rPr>
+        <w:t xml:space="preserve">client/js/char/view.js</w:t>
+      </w:r>
+      <w:r>
+        <w:rPr>
+          <w:rFonts w:ascii="Calibri" w:cs="Calibri" w:eastAsia="Calibri" w:hAnsi="Calibri"/>
+          <w:color w:val="1F2328"/>
+        </w:rPr>
+        <w:t xml:space="preserve"> (</w:t>
+      </w:r>
+      <w:r>
+        <w:rPr>
+          <w:rFonts w:ascii="Consolas" w:cs="Consolas" w:eastAsia="Consolas" w:hAnsi="Consolas"/>
+          <w:color w:val="0B5394"/>
+          <w:sz w:val="19"/>
+          <w:szCs w:val="19"/>
+        </w:rPr>
+        <w:t xml:space="preserve">placeFlipped</w:t>
+      </w:r>
+      <w:r>
+        <w:rPr>
+          <w:rFonts w:ascii="Calibri" w:cs="Calibri" w:eastAsia="Calibri" w:hAnsi="Calibri"/>
+          <w:color w:val="1F2328"/>
+        </w:rPr>
+        <w:t xml:space="preserve">), </w:t>
+      </w:r>
+      <w:r>
+        <w:rPr>
+          <w:rFonts w:ascii="Consolas" w:cs="Consolas" w:eastAsia="Consolas" w:hAnsi="Consolas"/>
+          <w:color w:val="0B5394"/>
+          <w:sz w:val="19"/>
+          <w:szCs w:val="19"/>
+        </w:rPr>
+        <w:t xml:space="preserve">client/js/sim/builds.js</w:t>
+      </w:r>
+      <w:r>
+        <w:rPr>
+          <w:rFonts w:ascii="Calibri" w:cs="Calibri" w:eastAsia="Calibri" w:hAnsi="Calibri"/>
+          <w:color w:val="1F2328"/>
+        </w:rPr>
+        <w:t xml:space="preserve"> (</w:t>
+      </w:r>
+      <w:r>
+        <w:rPr>
+          <w:rFonts w:ascii="Consolas" w:cs="Consolas" w:eastAsia="Consolas" w:hAnsi="Consolas"/>
+          <w:color w:val="0B5394"/>
+          <w:sz w:val="19"/>
+          <w:szCs w:val="19"/>
+        </w:rPr>
+        <w:t xml:space="preserve">inStore</w:t>
+      </w:r>
+      <w:r>
+        <w:rPr>
+          <w:rFonts w:ascii="Calibri" w:cs="Calibri" w:eastAsia="Calibri" w:hAnsi="Calibri"/>
+          <w:color w:val="1F2328"/>
+        </w:rPr>
+        <w:t xml:space="preserve">, </w:t>
+      </w:r>
+      <w:r>
+        <w:rPr>
+          <w:rFonts w:ascii="Consolas" w:cs="Consolas" w:eastAsia="Consolas" w:hAnsi="Consolas"/>
+          <w:color w:val="0B5394"/>
+          <w:sz w:val="19"/>
+          <w:szCs w:val="19"/>
+        </w:rPr>
+        <w:t xml:space="preserve">forBuild</w:t>
+      </w:r>
+      <w:r>
+        <w:rPr>
+          <w:rFonts w:ascii="Calibri" w:cs="Calibri" w:eastAsia="Calibri" w:hAnsi="Calibri"/>
+          <w:color w:val="1F2328"/>
+        </w:rPr>
+        <w:t xml:space="preserve">), the store, Inventory and My Player lists, </w:t>
+      </w:r>
+      <w:r>
+        <w:rPr>
+          <w:rFonts w:ascii="Consolas" w:cs="Consolas" w:eastAsia="Consolas" w:hAnsi="Consolas"/>
+          <w:color w:val="0B5394"/>
+          <w:sz w:val="19"/>
+          <w:szCs w:val="19"/>
+        </w:rPr>
+        <w:t xml:space="preserve">client/js/game/session.js</w:t>
+      </w:r>
+      <w:r>
+        <w:rPr>
+          <w:rFonts w:ascii="Calibri" w:cs="Calibri" w:eastAsia="Calibri" w:hAnsi="Calibri"/>
+          <w:color w:val="1F2328"/>
+        </w:rPr>
+        <w:t xml:space="preserve"> (TAKE IT BACK, the glow flare, the crowd on a backflip), </w:t>
+      </w:r>
+      <w:r>
+        <w:rPr>
+          <w:rFonts w:ascii="Consolas" w:cs="Consolas" w:eastAsia="Consolas" w:hAnsi="Consolas"/>
+          <w:color w:val="0B5394"/>
+          <w:sz w:val="19"/>
+          <w:szCs w:val="19"/>
+        </w:rPr>
+        <w:t xml:space="preserve">server/catalog.json</w:t>
+      </w:r>
+      <w:r>
+        <w:rPr>
+          <w:rFonts w:ascii="Calibri" w:cs="Calibri" w:eastAsia="Calibri" w:hAnsi="Calibri"/>
+          <w:color w:val="1F2328"/>
+        </w:rPr>
+        <w:t xml:space="preserve"> (</w:t>
+      </w:r>
+      <w:r>
+        <w:rPr>
+          <w:rFonts w:ascii="Consolas" w:cs="Consolas" w:eastAsia="Consolas" w:hAnsi="Consolas"/>
+          <w:color w:val="0B5394"/>
+          <w:sz w:val="19"/>
+          <w:szCs w:val="19"/>
+        </w:rPr>
+        <w:t xml:space="preserve">js_base_sharpeye</w:t>
+      </w:r>
+      <w:r>
+        <w:rPr>
+          <w:rFonts w:ascii="Calibri" w:cs="Calibri" w:eastAsia="Calibri" w:hAnsi="Calibri"/>
+          <w:color w:val="1F2328"/>
+        </w:rPr>
+        <w:t xml:space="preserve">, </w:t>
+      </w:r>
+      <w:r>
+        <w:rPr>
+          <w:rFonts w:ascii="Consolas" w:cs="Consolas" w:eastAsia="Consolas" w:hAnsi="Consolas"/>
+          <w:color w:val="0B5394"/>
+          <w:sz w:val="19"/>
+          <w:szCs w:val="19"/>
+        </w:rPr>
+        <w:t xml:space="preserve">release_sharpeye</w:t>
+      </w:r>
+      <w:r>
+        <w:rPr>
+          <w:rFonts w:ascii="Calibri" w:cs="Calibri" w:eastAsia="Calibri" w:hAnsi="Calibri"/>
+          <w:color w:val="1F2328"/>
+        </w:rPr>
+        <w:t xml:space="preserve">: </w:t>
+      </w:r>
+      <w:r>
+        <w:rPr>
+          <w:rFonts w:ascii="Consolas" w:cs="Consolas" w:eastAsia="Consolas" w:hAnsi="Consolas"/>
+          <w:color w:val="0B5394"/>
+          <w:sz w:val="19"/>
+          <w:szCs w:val="19"/>
+        </w:rPr>
+        <w:t xml:space="preserve">exclusive</w:t>
+      </w:r>
+      <w:r>
+        <w:rPr>
+          <w:rFonts w:ascii="Calibri" w:cs="Calibri" w:eastAsia="Calibri" w:hAnsi="Calibri"/>
+          <w:color w:val="1F2328"/>
+        </w:rPr>
+        <w:t xml:space="preserve"> icon, </w:t>
+      </w:r>
+      <w:r>
+        <w:rPr>
+          <w:rFonts w:ascii="Consolas" w:cs="Consolas" w:eastAsia="Consolas" w:hAnsi="Consolas"/>
+          <w:color w:val="0B5394"/>
+          <w:sz w:val="19"/>
+          <w:szCs w:val="19"/>
+        </w:rPr>
+        <w:t xml:space="preserve">secret</w:t>
+      </w:r>
+      <w:r>
+        <w:rPr>
+          <w:rFonts w:ascii="Calibri" w:cs="Calibri" w:eastAsia="Calibri" w:hAnsi="Calibri"/>
+          <w:color w:val="1F2328"/>
+        </w:rPr>
+        <w:t xml:space="preserve">), </w:t>
+      </w:r>
+      <w:r>
+        <w:rPr>
+          <w:rFonts w:ascii="Consolas" w:cs="Consolas" w:eastAsia="Consolas" w:hAnsi="Consolas"/>
+          <w:color w:val="0B5394"/>
+          <w:sz w:val="19"/>
+          <w:szCs w:val="19"/>
+        </w:rPr>
+        <w:t xml:space="preserve">server/app.py</w:t>
+      </w:r>
+      <w:r>
+        <w:rPr>
+          <w:rFonts w:ascii="Calibri" w:cs="Calibri" w:eastAsia="Calibri" w:hAnsi="Calibri"/>
+          <w:color w:val="1F2328"/>
+        </w:rPr>
+        <w:t xml:space="preserve"> (the package put on once for builds that already hold Sharp Eye), the Icon badge's description in </w:t>
+      </w:r>
+      <w:r>
+        <w:rPr>
+          <w:rFonts w:ascii="Consolas" w:cs="Consolas" w:eastAsia="Consolas" w:hAnsi="Consolas"/>
+          <w:color w:val="0B5394"/>
+          <w:sz w:val="19"/>
+          <w:szCs w:val="19"/>
+        </w:rPr>
+        <w:t xml:space="preserve">server/progression.py</w:t>
+      </w:r>
+      <w:r>
+        <w:rPr>
+          <w:rFonts w:ascii="Calibri" w:cs="Calibri" w:eastAsia="Calibri" w:hAnsi="Calibri"/>
+          <w:color w:val="1F2328"/>
+        </w:rPr>
+        <w:t xml:space="preserve"> and </w:t>
+      </w:r>
+      <w:r>
+        <w:rPr>
+          <w:rFonts w:ascii="Consolas" w:cs="Consolas" w:eastAsia="Consolas" w:hAnsi="Consolas"/>
+          <w:color w:val="0B5394"/>
+          <w:sz w:val="19"/>
+          <w:szCs w:val="19"/>
+        </w:rPr>
+        <w:t xml:space="preserve">client/js/sim/badges.js</w:t>
+      </w:r>
+      <w:r>
+        <w:rPr>
+          <w:rFonts w:ascii="Calibri" w:cs="Calibri" w:eastAsia="Calibri" w:hAnsi="Calibri"/>
+          <w:color w:val="1F2328"/>
+        </w:rPr>
+        <w:t xml:space="preserve">. Tests: </w:t>
+      </w:r>
+      <w:r>
+        <w:rPr>
+          <w:rFonts w:ascii="Consolas" w:cs="Consolas" w:eastAsia="Consolas" w:hAnsi="Consolas"/>
+          <w:color w:val="0B5394"/>
+          <w:sz w:val="19"/>
+          <w:szCs w:val="19"/>
+        </w:rPr>
+        <w:t xml:space="preserve">tests/v048qp2.test.mjs</w:t>
+      </w:r>
+      <w:r>
+        <w:rPr>
+          <w:rFonts w:ascii="Calibri" w:cs="Calibri" w:eastAsia="Calibri" w:hAnsi="Calibri"/>
+          <w:color w:val="1F2328"/>
+        </w:rPr>
+        <w:t xml:space="preserve"> (6), </w:t>
+      </w:r>
+      <w:r>
+        <w:rPr>
+          <w:rFonts w:ascii="Consolas" w:cs="Consolas" w:eastAsia="Consolas" w:hAnsi="Consolas"/>
+          <w:color w:val="0B5394"/>
+          <w:sz w:val="19"/>
+          <w:szCs w:val="19"/>
+        </w:rPr>
+        <w:t xml:space="preserve">test_server.py</w:t>
+      </w:r>
+      <w:r>
+        <w:rPr>
+          <w:rFonts w:ascii="Calibri" w:cs="Calibri" w:eastAsia="Calibri" w:hAnsi="Calibri"/>
+          <w:color w:val="1F2328"/>
+        </w:rPr>
+        <w:t xml:space="preserve"> (the package is the holder's alone; the unlock puts it on), </w:t>
+      </w:r>
+      <w:r>
+        <w:rPr>
+          <w:rFonts w:ascii="Consolas" w:cs="Consolas" w:eastAsia="Consolas" w:hAnsi="Consolas"/>
+          <w:color w:val="0B5394"/>
+          <w:sz w:val="19"/>
+          <w:szCs w:val="19"/>
+        </w:rPr>
+        <w:t xml:space="preserve">stage7</w:t>
+      </w:r>
+      <w:r>
+        <w:rPr>
+          <w:rFonts w:ascii="Calibri" w:cs="Calibri" w:eastAsia="Calibri" w:hAnsi="Calibri"/>
+          <w:color w:val="1F2328"/>
+        </w:rPr>
+        <w:t xml:space="preserve">/</w:t>
+      </w:r>
+      <w:r>
+        <w:rPr>
+          <w:rFonts w:ascii="Consolas" w:cs="Consolas" w:eastAsia="Consolas" w:hAnsi="Consolas"/>
+          <w:color w:val="0B5394"/>
+          <w:sz w:val="19"/>
+          <w:szCs w:val="19"/>
+        </w:rPr>
+        <w:t xml:space="preserve">v0475</w:t>
+      </w:r>
+      <w:r>
+        <w:rPr>
+          <w:rFonts w:ascii="Calibri" w:cs="Calibri" w:eastAsia="Calibri" w:hAnsi="Calibri"/>
+          <w:color w:val="1F2328"/>
+        </w:rPr>
+        <w:t xml:space="preserve"> counts.</w:t>
+      </w:r>
+    </w:p>
+    <w:p>
+      <w:pPr>
+        <w:pStyle w:val="ListParagraph"/>
+        <w:numPr>
+          <w:ilvl w:val="0"/>
+          <w:numId w:val="2"/>
+        </w:numPr>
+        <w:spacing w:after="80" w:line="276"/>
+      </w:pPr>
+      <w:r>
+        <w:rPr>
+          <w:rFonts w:ascii="Calibri" w:cs="Calibri" w:eastAsia="Calibri" w:hAnsi="Calibri"/>
+          <w:color w:val="1F2328"/>
+        </w:rPr>
+        <w:t xml:space="preserve">Tests: 247 Node and 76 Python.</w:t>
       </w:r>
     </w:p>
     <w:sectPr>

</xml_diff>